<commit_message>
feat(home): sync featured selection and restore video2 background
Apply homepage featured-selection logic to use the real featured content, restore video2 as hero background media, and include your local asset/config updates for deployment parity.

Co-authored-by: Cursor <cursoragent@cursor.com>
</commit_message>
<xml_diff>
--- a/cahier de charges.docx
+++ b/cahier de charges.docx
@@ -305,6 +305,29 @@
       </w:r>
     </w:p>
     <w:p>
+      <w:pPr>
+        <w:pStyle w:val="Listepuces"/>
+        <w:numPr>
+          <w:ilvl w:val="0"/>
+          <w:numId w:val="0"/>
+        </w:numPr>
+        <w:ind w:left="360" w:hanging="360"/>
+      </w:pPr>
+    </w:p>
+    <w:p>
+      <w:pPr>
+        <w:pStyle w:val="Listepuces"/>
+        <w:numPr>
+          <w:ilvl w:val="0"/>
+          <w:numId w:val="0"/>
+        </w:numPr>
+        <w:ind w:left="360" w:hanging="360"/>
+      </w:pPr>
+      <w:r>
+        <w:t>A mettre bfm et midi olympique, la chaine ici</w:t>
+      </w:r>
+    </w:p>
+    <w:p>
       <w:r>
         <w:t>Bénéfice : Les visiteurs comprennent rapidement votre offre et peuvent facilement vous contacter.</w:t>
       </w:r>
@@ -314,18 +337,10 @@
         <w:pStyle w:val="Titre1"/>
       </w:pPr>
       <w:r>
-        <w:t xml:space="preserve">7. </w:t>
-      </w:r>
-      <w:proofErr w:type="gramStart"/>
-      <w:r>
-        <w:t>Contact</w:t>
+        <w:t>7. Contact</w:t>
       </w:r>
       <w:r>
-        <w:t>ez moi</w:t>
-      </w:r>
-      <w:proofErr w:type="gramEnd"/>
-      <w:r>
-        <w:t xml:space="preserve"> (beaucoup visible en plus en haut de page)</w:t>
+        <w:t>ez moi (beaucoup visible en plus en haut de page)</w:t>
       </w:r>
     </w:p>
     <w:p>
@@ -341,15 +356,7 @@
         <w:pStyle w:val="Listepuces"/>
       </w:pPr>
       <w:r>
-        <w:t xml:space="preserve">Votre </w:t>
-      </w:r>
-      <w:proofErr w:type="gramStart"/>
-      <w:r>
-        <w:t>email</w:t>
-      </w:r>
-      <w:proofErr w:type="gramEnd"/>
-      <w:r>
-        <w:t xml:space="preserve"> est visible pour un contact direct.</w:t>
+        <w:t>Votre email est visible pour un contact direct.</w:t>
       </w:r>
     </w:p>
     <w:p>
@@ -437,6 +444,7 @@
         <w:pStyle w:val="Listepuces"/>
       </w:pPr>
       <w:r>
+        <w:lastRenderedPageBreak/>
         <w:t>Un outil permet de générer des résumés rapidement.</w:t>
       </w:r>
     </w:p>
@@ -453,7 +461,6 @@
         <w:pStyle w:val="Listepuces"/>
       </w:pPr>
       <w:r>
-        <w:lastRenderedPageBreak/>
         <w:t>Une aide à l’optimisation SEO est intégrée.</w:t>
       </w:r>
     </w:p>

</xml_diff>